<commit_message>
Wire logistics and 1C into the app and harden production behind the proxy.
Improve order/task screens and service imports, and enable secure cookies when DEBUG is off.

Co-authored-by: Cursor <cursoragent@cursor.com>
</commit_message>
<xml_diff>
--- a/docs/регламент-приемки.docx
+++ b/docs/регламент-приемки.docx
@@ -4,76 +4,91 @@
   <w:body>
     <w:p>
       <w:pPr>
-        <w:spacing w:before="0" w:after="0" w:line="240" w:lineRule="auto"/>
-        <w:jc w:val="left"/>
-        <w:keepLines/>
+        <w:widowControl w:val="0"/>
+        <w:spacing w:before="0" w:after="0" w:lineRule="exact" w:line="560"/>
+        <w:ind w:left="0"/>
+        <w:snapToGrid w:val="0"/>
+        <w:autoSpaceDE w:val="0"/>
+        <w:autoSpaceDN w:val="0"/>
       </w:pPr>
       <w:r>
         <w:rPr>
-          <w:rFonts w:ascii="Arial" w:hAnsi="Arial" w:cs="Arial"/>
+          <w:rFonts w:ascii="Calibri" w:hAnsi="Calibri" w:cs="Calibri"/>
           <w:b/>
-          <w:color w:val="143048"/>
-          <w:sz w:val="52"/>
+          <w:i w:val="0"/>
+          <w:color w:val="1B3650"/>
+          <w:sz w:val="44"/>
         </w:rPr>
         <w:t>Приёмка товара</w:t>
       </w:r>
     </w:p>
     <w:p>
       <w:pPr>
-        <w:spacing w:before="40" w:after="20" w:line="240" w:lineRule="auto"/>
-        <w:jc w:val="left"/>
-        <w:keepLines/>
+        <w:widowControl w:val="0"/>
+        <w:spacing w:before="20" w:after="0" w:lineRule="exact" w:line="320"/>
+        <w:ind w:left="0"/>
+        <w:snapToGrid w:val="0"/>
+        <w:autoSpaceDE w:val="0"/>
+        <w:autoSpaceDN w:val="0"/>
       </w:pPr>
       <w:r>
         <w:rPr>
-          <w:rFonts w:ascii="Arial" w:hAnsi="Arial" w:cs="Arial"/>
+          <w:rFonts w:ascii="Calibri" w:hAnsi="Calibri" w:cs="Calibri"/>
           <w:b w:val="0"/>
-          <w:sz w:val="28"/>
+          <w:i w:val="0"/>
+          <w:color w:val="14181C"/>
+          <w:sz w:val="24"/>
         </w:rPr>
         <w:t>Иди по цифрам сверху вниз. Шаги местами не меняй.</w:t>
       </w:r>
     </w:p>
     <w:p>
       <w:pPr>
-        <w:spacing w:before="0" w:after="160" w:line="240" w:lineRule="auto"/>
-        <w:jc w:val="left"/>
-        <w:keepLines/>
+        <w:widowControl w:val="0"/>
+        <w:spacing w:before="0" w:after="120" w:lineRule="exact" w:line="320"/>
+        <w:ind w:left="0"/>
+        <w:snapToGrid w:val="0"/>
+        <w:autoSpaceDE w:val="0"/>
+        <w:autoSpaceDN w:val="0"/>
       </w:pPr>
       <w:r>
         <w:rPr>
-          <w:rFonts w:ascii="Arial" w:hAnsi="Arial" w:cs="Arial"/>
+          <w:rFonts w:ascii="Calibri" w:hAnsi="Calibri" w:cs="Calibri"/>
           <w:b/>
-          <w:sz w:val="28"/>
+          <w:i w:val="0"/>
+          <w:color w:val="14181C"/>
+          <w:sz w:val="24"/>
         </w:rPr>
         <w:t xml:space="preserve">Готово, когда </w:t>
       </w:r>
       <w:r>
         <w:rPr>
-          <w:rFonts w:ascii="Arial" w:hAnsi="Arial" w:cs="Arial"/>
+          <w:rFonts w:ascii="Calibri" w:hAnsi="Calibri" w:cs="Calibri"/>
           <w:b w:val="0"/>
-          <w:sz w:val="28"/>
+          <w:i w:val="0"/>
+          <w:color w:val="14181C"/>
+          <w:sz w:val="24"/>
         </w:rPr>
         <w:t>на каждой паллете есть паспорт, а чистый вес сошёлся с заказом и с накладной.</w:t>
       </w:r>
     </w:p>
     <w:tbl>
       <w:tblPr>
-        <w:tblW w:type="dxa" w:w="10545"/>
+        <w:tblW w:type="dxa" w:w="10318"/>
         <w:jc w:val="center"/>
         <w:tblLayout w:type="fixed"/>
         <w:tblLook w:firstColumn="1" w:firstRow="1" w:lastColumn="0" w:lastRow="0" w:noHBand="0" w:noVBand="1" w:val="04A0"/>
         <w:tblBorders>
-          <w:top w:val="single" w:sz="4" w:space="0" w:color="BFCBD6"/>
-          <w:left w:val="single" w:sz="4" w:space="0" w:color="BFCBD6"/>
-          <w:bottom w:val="single" w:sz="4" w:space="0" w:color="BFCBD6"/>
-          <w:right w:val="single" w:sz="4" w:space="0" w:color="BFCBD6"/>
-          <w:insideH w:val="single" w:sz="4" w:space="0" w:color="BFCBD6"/>
-          <w:insideV w:val="single" w:sz="4" w:space="0" w:color="BFCBD6"/>
+          <w:top w:val="single" w:sz="4" w:space="0" w:color="E6EAEF"/>
+          <w:left w:val="single" w:sz="4" w:space="0" w:color="E6EAEF"/>
+          <w:bottom w:val="single" w:sz="4" w:space="0" w:color="E6EAEF"/>
+          <w:right w:val="single" w:sz="4" w:space="0" w:color="E6EAEF"/>
+          <w:insideH w:val="single" w:sz="4" w:space="0" w:color="E6EAEF"/>
+          <w:insideV w:val="single" w:sz="4" w:space="0" w:color="E6EAEF"/>
         </w:tblBorders>
       </w:tblPr>
       <w:tblGrid>
-        <w:gridCol w:w="907"/>
-        <w:gridCol w:w="9638"/>
+        <w:gridCol w:w="10318"/>
       </w:tblGrid>
       <w:tr>
         <w:trPr>
@@ -81,95 +96,134 @@
         </w:trPr>
         <w:tc>
           <w:tcPr>
-            <w:tcW w:type="dxa" w:w="907"/>
-            <w:shd w:val="clear" w:color="auto" w:fill="1B4F72"/>
+            <w:tcW w:type="dxa" w:w="10318"/>
+            <w:shd w:val="clear" w:color="auto" w:fill="FFFFFF"/>
             <w:tcMar>
-              <w:top w:w="79" w:type="dxa"/>
-              <w:left w:w="34" w:type="dxa"/>
-              <w:bottom w:w="79" w:type="dxa"/>
-              <w:right w:w="34" w:type="dxa"/>
+              <w:top w:w="65" w:type="dxa"/>
+              <w:left w:w="125" w:type="dxa"/>
+              <w:bottom w:w="60" w:type="dxa"/>
+              <w:right w:w="113" w:type="dxa"/>
             </w:tcMar>
-            <w:vAlign w:val="center"/>
           </w:tcPr>
           <w:p>
             <w:pPr>
-              <w:spacing w:before="0" w:after="0" w:line="240" w:lineRule="auto"/>
-              <w:jc w:val="center"/>
-              <w:keepLines/>
+              <w:widowControl w:val="0"/>
+              <w:spacing w:before="0" w:after="20" w:lineRule="exact" w:line="320"/>
+              <w:ind w:left="0"/>
+              <w:snapToGrid w:val="0"/>
+              <w:tabs>
+                <w:tab w:pos="454" w:val="left"/>
+              </w:tabs>
+              <w:autoSpaceDE w:val="0"/>
+              <w:autoSpaceDN w:val="0"/>
             </w:pPr>
             <w:r>
               <w:rPr>
-                <w:rFonts w:ascii="Arial" w:hAnsi="Arial" w:cs="Arial"/>
+                <w:rFonts w:ascii="Calibri" w:hAnsi="Calibri" w:cs="Calibri"/>
                 <w:b/>
-                <w:color w:val="FFFFFF"/>
-                <w:sz w:val="44"/>
+                <w:i w:val="0"/>
+                <w:color w:val="1B3650"/>
+                <w:sz w:val="28"/>
               </w:rPr>
               <w:t>1</w:t>
             </w:r>
-          </w:p>
-        </w:tc>
-        <w:tc>
-          <w:tcPr>
-            <w:tcW w:type="dxa" w:w="9638"/>
-            <w:shd w:val="clear" w:color="auto" w:fill="FFFFFF"/>
-            <w:tcMar>
-              <w:top w:w="74" w:type="dxa"/>
-              <w:left w:w="136" w:type="dxa"/>
-              <w:bottom w:w="79" w:type="dxa"/>
-              <w:right w:w="125" w:type="dxa"/>
-            </w:tcMar>
-            <w:vAlign w:val="center"/>
-          </w:tcPr>
-          <w:p>
-            <w:pPr>
-              <w:spacing w:before="0" w:after="20" w:line="230" w:lineRule="auto"/>
-              <w:jc w:val="left"/>
-              <w:keepLines/>
-            </w:pPr>
             <w:r>
               <w:rPr>
-                <w:rFonts w:ascii="Arial" w:hAnsi="Arial" w:cs="Arial"/>
+                <w:rFonts w:ascii="Calibri" w:hAnsi="Calibri" w:cs="Calibri"/>
                 <w:b/>
-                <w:color w:val="143048"/>
-                <w:sz w:val="28"/>
+                <w:i w:val="0"/>
+                <w:color w:val="1B3650"/>
+                <w:sz w:val="26"/>
               </w:rPr>
+              <w:tab/>
               <w:t>Узнай, кто привёз</w:t>
             </w:r>
           </w:p>
           <w:p>
             <w:pPr>
-              <w:spacing w:before="0" w:after="20" w:line="230" w:lineRule="auto"/>
-              <w:jc w:val="left"/>
-              <w:keepLines/>
+              <w:widowControl w:val="0"/>
+              <w:spacing w:before="0" w:after="0" w:lineRule="exact" w:line="300"/>
+              <w:ind w:left="692" w:hanging="238"/>
+              <w:snapToGrid w:val="0"/>
+              <w:autoSpaceDE w:val="0"/>
+              <w:autoSpaceDN w:val="0"/>
             </w:pPr>
             <w:r>
               <w:rPr>
-                <w:rFonts w:ascii="Arial" w:hAnsi="Arial" w:cs="Arial"/>
+                <w:rFonts w:ascii="Calibri" w:hAnsi="Calibri" w:cs="Calibri"/>
                 <w:b w:val="0"/>
+                <w:i w:val="0"/>
+                <w:color w:val="14181C"/>
                 <w:sz w:val="24"/>
               </w:rPr>
-              <w:t>Спроси у водителя три вещи: кто поставщик, какой товар и где накладная.</w:t>
+              <w:t>•  кто поставщик</w:t>
             </w:r>
           </w:p>
           <w:p>
             <w:pPr>
-              <w:spacing w:before="20" w:after="0" w:line="230" w:lineRule="auto"/>
-              <w:jc w:val="left"/>
-              <w:keepLines/>
+              <w:widowControl w:val="0"/>
+              <w:spacing w:before="0" w:after="0" w:lineRule="exact" w:line="300"/>
+              <w:ind w:left="692" w:hanging="238"/>
+              <w:snapToGrid w:val="0"/>
+              <w:autoSpaceDE w:val="0"/>
+              <w:autoSpaceDN w:val="0"/>
             </w:pPr>
             <w:r>
               <w:rPr>
-                <w:rFonts w:ascii="Arial" w:hAnsi="Arial" w:cs="Arial"/>
+                <w:rFonts w:ascii="Calibri" w:hAnsi="Calibri" w:cs="Calibri"/>
+                <w:b w:val="0"/>
+                <w:i w:val="0"/>
+                <w:color w:val="14181C"/>
+                <w:sz w:val="24"/>
+              </w:rPr>
+              <w:t>•  какой товар</w:t>
+            </w:r>
+          </w:p>
+          <w:p>
+            <w:pPr>
+              <w:widowControl w:val="0"/>
+              <w:spacing w:before="0" w:after="0" w:lineRule="exact" w:line="300"/>
+              <w:ind w:left="692" w:hanging="238"/>
+              <w:snapToGrid w:val="0"/>
+              <w:autoSpaceDE w:val="0"/>
+              <w:autoSpaceDN w:val="0"/>
+            </w:pPr>
+            <w:r>
+              <w:rPr>
+                <w:rFonts w:ascii="Calibri" w:hAnsi="Calibri" w:cs="Calibri"/>
+                <w:b w:val="0"/>
+                <w:i w:val="0"/>
+                <w:color w:val="14181C"/>
+                <w:sz w:val="24"/>
+              </w:rPr>
+              <w:t>•  где накладная</w:t>
+            </w:r>
+          </w:p>
+          <w:p>
+            <w:pPr>
+              <w:widowControl w:val="0"/>
+              <w:spacing w:before="20" w:after="0" w:lineRule="exact" w:line="300"/>
+              <w:ind w:left="454"/>
+              <w:snapToGrid w:val="0"/>
+              <w:autoSpaceDE w:val="0"/>
+              <w:autoSpaceDN w:val="0"/>
+            </w:pPr>
+            <w:r>
+              <w:rPr>
+                <w:rFonts w:ascii="Calibri" w:hAnsi="Calibri" w:cs="Calibri"/>
                 <w:b/>
-                <w:color w:val="8C2D1E"/>
+                <w:i w:val="0"/>
+                <w:color w:val="99281C"/>
                 <w:sz w:val="24"/>
               </w:rPr>
               <w:t xml:space="preserve">Стоп. </w:t>
             </w:r>
             <w:r>
               <w:rPr>
-                <w:rFonts w:ascii="Arial" w:hAnsi="Arial" w:cs="Arial"/>
+                <w:rFonts w:ascii="Calibri" w:hAnsi="Calibri" w:cs="Calibri"/>
                 <w:b/>
+                <w:i w:val="0"/>
+                <w:color w:val="14181C"/>
                 <w:sz w:val="24"/>
               </w:rPr>
               <w:t>Неясно, кто привёз — заказ не ищи и машину не разгружай.</w:t>
@@ -183,95 +237,134 @@
         </w:trPr>
         <w:tc>
           <w:tcPr>
-            <w:tcW w:type="dxa" w:w="907"/>
-            <w:shd w:val="clear" w:color="auto" w:fill="1B4F72"/>
+            <w:tcW w:type="dxa" w:w="10318"/>
+            <w:shd w:val="clear" w:color="auto" w:fill="FFFFFF"/>
             <w:tcMar>
-              <w:top w:w="79" w:type="dxa"/>
-              <w:left w:w="34" w:type="dxa"/>
-              <w:bottom w:w="79" w:type="dxa"/>
-              <w:right w:w="34" w:type="dxa"/>
+              <w:top w:w="65" w:type="dxa"/>
+              <w:left w:w="125" w:type="dxa"/>
+              <w:bottom w:w="60" w:type="dxa"/>
+              <w:right w:w="113" w:type="dxa"/>
             </w:tcMar>
-            <w:vAlign w:val="center"/>
           </w:tcPr>
           <w:p>
             <w:pPr>
-              <w:spacing w:before="0" w:after="0" w:line="240" w:lineRule="auto"/>
-              <w:jc w:val="center"/>
-              <w:keepLines/>
+              <w:widowControl w:val="0"/>
+              <w:spacing w:before="0" w:after="20" w:lineRule="exact" w:line="320"/>
+              <w:ind w:left="0"/>
+              <w:snapToGrid w:val="0"/>
+              <w:tabs>
+                <w:tab w:pos="454" w:val="left"/>
+              </w:tabs>
+              <w:autoSpaceDE w:val="0"/>
+              <w:autoSpaceDN w:val="0"/>
             </w:pPr>
             <w:r>
               <w:rPr>
-                <w:rFonts w:ascii="Arial" w:hAnsi="Arial" w:cs="Arial"/>
+                <w:rFonts w:ascii="Calibri" w:hAnsi="Calibri" w:cs="Calibri"/>
                 <w:b/>
-                <w:color w:val="FFFFFF"/>
-                <w:sz w:val="44"/>
+                <w:i w:val="0"/>
+                <w:color w:val="1B3650"/>
+                <w:sz w:val="28"/>
               </w:rPr>
               <w:t>2</w:t>
             </w:r>
-          </w:p>
-        </w:tc>
-        <w:tc>
-          <w:tcPr>
-            <w:tcW w:type="dxa" w:w="9638"/>
-            <w:shd w:val="clear" w:color="auto" w:fill="FFFFFF"/>
-            <w:tcMar>
-              <w:top w:w="74" w:type="dxa"/>
-              <w:left w:w="136" w:type="dxa"/>
-              <w:bottom w:w="79" w:type="dxa"/>
-              <w:right w:w="125" w:type="dxa"/>
-            </w:tcMar>
-            <w:vAlign w:val="center"/>
-          </w:tcPr>
-          <w:p>
-            <w:pPr>
-              <w:spacing w:before="0" w:after="20" w:line="230" w:lineRule="auto"/>
-              <w:jc w:val="left"/>
-              <w:keepLines/>
-            </w:pPr>
             <w:r>
               <w:rPr>
-                <w:rFonts w:ascii="Arial" w:hAnsi="Arial" w:cs="Arial"/>
+                <w:rFonts w:ascii="Calibri" w:hAnsi="Calibri" w:cs="Calibri"/>
                 <w:b/>
-                <w:color w:val="143048"/>
-                <w:sz w:val="28"/>
+                <w:i w:val="0"/>
+                <w:color w:val="1B3650"/>
+                <w:sz w:val="26"/>
               </w:rPr>
+              <w:tab/>
               <w:t>Найди заказ в 1С</w:t>
             </w:r>
           </w:p>
           <w:p>
             <w:pPr>
-              <w:spacing w:before="0" w:after="20" w:line="230" w:lineRule="auto"/>
-              <w:jc w:val="left"/>
-              <w:keepLines/>
+              <w:widowControl w:val="0"/>
+              <w:spacing w:before="0" w:after="0" w:lineRule="exact" w:line="300"/>
+              <w:ind w:left="692" w:hanging="238"/>
+              <w:snapToGrid w:val="0"/>
+              <w:autoSpaceDE w:val="0"/>
+              <w:autoSpaceDN w:val="0"/>
             </w:pPr>
             <w:r>
               <w:rPr>
-                <w:rFonts w:ascii="Arial" w:hAnsi="Arial" w:cs="Arial"/>
+                <w:rFonts w:ascii="Calibri" w:hAnsi="Calibri" w:cs="Calibri"/>
                 <w:b w:val="0"/>
+                <w:i w:val="0"/>
+                <w:color w:val="14181C"/>
                 <w:sz w:val="24"/>
               </w:rPr>
-              <w:t>По имени поставщика открой заказ. В складской программе открой задание на эту машину и впиши номер накладной.</w:t>
+              <w:t>•  открой заказ этого поставщика на экране или распечатай</w:t>
             </w:r>
           </w:p>
           <w:p>
             <w:pPr>
-              <w:spacing w:before="20" w:after="0" w:line="230" w:lineRule="auto"/>
-              <w:jc w:val="left"/>
-              <w:keepLines/>
+              <w:widowControl w:val="0"/>
+              <w:spacing w:before="0" w:after="0" w:lineRule="exact" w:line="300"/>
+              <w:ind w:left="692" w:hanging="238"/>
+              <w:snapToGrid w:val="0"/>
+              <w:autoSpaceDE w:val="0"/>
+              <w:autoSpaceDN w:val="0"/>
             </w:pPr>
             <w:r>
               <w:rPr>
-                <w:rFonts w:ascii="Arial" w:hAnsi="Arial" w:cs="Arial"/>
+                <w:rFonts w:ascii="Calibri" w:hAnsi="Calibri" w:cs="Calibri"/>
+                <w:b w:val="0"/>
+                <w:i w:val="0"/>
+                <w:color w:val="14181C"/>
+                <w:sz w:val="24"/>
+              </w:rPr>
+              <w:t>•  в программе открой задание на приёмку</w:t>
+            </w:r>
+          </w:p>
+          <w:p>
+            <w:pPr>
+              <w:widowControl w:val="0"/>
+              <w:spacing w:before="0" w:after="0" w:lineRule="exact" w:line="300"/>
+              <w:ind w:left="692" w:hanging="238"/>
+              <w:snapToGrid w:val="0"/>
+              <w:autoSpaceDE w:val="0"/>
+              <w:autoSpaceDN w:val="0"/>
+            </w:pPr>
+            <w:r>
+              <w:rPr>
+                <w:rFonts w:ascii="Calibri" w:hAnsi="Calibri" w:cs="Calibri"/>
+                <w:b w:val="0"/>
+                <w:i w:val="0"/>
+                <w:color w:val="14181C"/>
+                <w:sz w:val="24"/>
+              </w:rPr>
+              <w:t>•  впиши номер накладной</w:t>
+            </w:r>
+          </w:p>
+          <w:p>
+            <w:pPr>
+              <w:widowControl w:val="0"/>
+              <w:spacing w:before="20" w:after="0" w:lineRule="exact" w:line="300"/>
+              <w:ind w:left="454"/>
+              <w:snapToGrid w:val="0"/>
+              <w:autoSpaceDE w:val="0"/>
+              <w:autoSpaceDN w:val="0"/>
+            </w:pPr>
+            <w:r>
+              <w:rPr>
+                <w:rFonts w:ascii="Calibri" w:hAnsi="Calibri" w:cs="Calibri"/>
                 <w:b/>
-                <w:color w:val="8C2D1E"/>
+                <w:i w:val="0"/>
+                <w:color w:val="99281C"/>
                 <w:sz w:val="24"/>
               </w:rPr>
               <w:t xml:space="preserve">Стоп. </w:t>
             </w:r>
             <w:r>
               <w:rPr>
-                <w:rFonts w:ascii="Arial" w:hAnsi="Arial" w:cs="Arial"/>
+                <w:rFonts w:ascii="Calibri" w:hAnsi="Calibri" w:cs="Calibri"/>
                 <w:b/>
+                <w:i w:val="0"/>
+                <w:color w:val="14181C"/>
                 <w:sz w:val="24"/>
               </w:rPr>
               <w:t>Заказа нет — товар не выгружай. Позвони в офис.</w:t>
@@ -285,95 +378,174 @@
         </w:trPr>
         <w:tc>
           <w:tcPr>
-            <w:tcW w:type="dxa" w:w="907"/>
-            <w:shd w:val="clear" w:color="auto" w:fill="1B4F72"/>
+            <w:tcW w:type="dxa" w:w="10318"/>
+            <w:shd w:val="clear" w:color="auto" w:fill="FFFFFF"/>
             <w:tcMar>
-              <w:top w:w="79" w:type="dxa"/>
-              <w:left w:w="34" w:type="dxa"/>
-              <w:bottom w:w="79" w:type="dxa"/>
-              <w:right w:w="34" w:type="dxa"/>
+              <w:top w:w="65" w:type="dxa"/>
+              <w:left w:w="125" w:type="dxa"/>
+              <w:bottom w:w="60" w:type="dxa"/>
+              <w:right w:w="113" w:type="dxa"/>
             </w:tcMar>
-            <w:vAlign w:val="center"/>
           </w:tcPr>
           <w:p>
             <w:pPr>
-              <w:spacing w:before="0" w:after="0" w:line="240" w:lineRule="auto"/>
-              <w:jc w:val="center"/>
-              <w:keepLines/>
+              <w:widowControl w:val="0"/>
+              <w:spacing w:before="0" w:after="20" w:lineRule="exact" w:line="320"/>
+              <w:ind w:left="0"/>
+              <w:snapToGrid w:val="0"/>
+              <w:tabs>
+                <w:tab w:pos="454" w:val="left"/>
+              </w:tabs>
+              <w:autoSpaceDE w:val="0"/>
+              <w:autoSpaceDN w:val="0"/>
             </w:pPr>
             <w:r>
               <w:rPr>
-                <w:rFonts w:ascii="Arial" w:hAnsi="Arial" w:cs="Arial"/>
+                <w:rFonts w:ascii="Calibri" w:hAnsi="Calibri" w:cs="Calibri"/>
                 <w:b/>
-                <w:color w:val="FFFFFF"/>
-                <w:sz w:val="44"/>
+                <w:i w:val="0"/>
+                <w:color w:val="1B3650"/>
+                <w:sz w:val="28"/>
               </w:rPr>
               <w:t>3</w:t>
             </w:r>
-          </w:p>
-        </w:tc>
-        <w:tc>
-          <w:tcPr>
-            <w:tcW w:type="dxa" w:w="9638"/>
-            <w:shd w:val="clear" w:color="auto" w:fill="FFFFFF"/>
-            <w:tcMar>
-              <w:top w:w="74" w:type="dxa"/>
-              <w:left w:w="136" w:type="dxa"/>
-              <w:bottom w:w="79" w:type="dxa"/>
-              <w:right w:w="125" w:type="dxa"/>
-            </w:tcMar>
-            <w:vAlign w:val="center"/>
-          </w:tcPr>
-          <w:p>
-            <w:pPr>
-              <w:spacing w:before="0" w:after="20" w:line="230" w:lineRule="auto"/>
-              <w:jc w:val="left"/>
-              <w:keepLines/>
-            </w:pPr>
             <w:r>
               <w:rPr>
-                <w:rFonts w:ascii="Arial" w:hAnsi="Arial" w:cs="Arial"/>
+                <w:rFonts w:ascii="Calibri" w:hAnsi="Calibri" w:cs="Calibri"/>
                 <w:b/>
-                <w:color w:val="143048"/>
-                <w:sz w:val="28"/>
+                <w:i w:val="0"/>
+                <w:color w:val="1B3650"/>
+                <w:sz w:val="26"/>
               </w:rPr>
-              <w:t>Прочитай комментарий</w:t>
+              <w:tab/>
+              <w:t>Прочитай комментарий до выгрузки</w:t>
             </w:r>
           </w:p>
           <w:p>
             <w:pPr>
-              <w:spacing w:before="0" w:after="20" w:line="230" w:lineRule="auto"/>
-              <w:jc w:val="left"/>
-              <w:keepLines/>
+              <w:widowControl w:val="0"/>
+              <w:spacing w:before="0" w:after="0" w:lineRule="exact" w:line="300"/>
+              <w:ind w:left="692" w:hanging="238"/>
+              <w:snapToGrid w:val="0"/>
+              <w:autoSpaceDE w:val="0"/>
+              <w:autoSpaceDN w:val="0"/>
             </w:pPr>
             <w:r>
               <w:rPr>
-                <w:rFonts w:ascii="Arial" w:hAnsi="Arial" w:cs="Arial"/>
+                <w:rFonts w:ascii="Calibri" w:hAnsi="Calibri" w:cs="Calibri"/>
                 <w:b w:val="0"/>
+                <w:i w:val="0"/>
+                <w:color w:val="14181C"/>
                 <w:sz w:val="24"/>
               </w:rPr>
-              <w:t>До выгрузки прочитай, как принимать эту машину: кому товар, калибр, сорт, упаковка, поддон, что снять на фото и нужен ли анализ. Товар для клиента другим не отдавай.</w:t>
+              <w:t>•  кому товар: на весь склад или одному клиенту</w:t>
             </w:r>
           </w:p>
           <w:p>
             <w:pPr>
-              <w:spacing w:before="20" w:after="0" w:line="230" w:lineRule="auto"/>
-              <w:jc w:val="left"/>
-              <w:keepLines/>
+              <w:widowControl w:val="0"/>
+              <w:spacing w:before="0" w:after="0" w:lineRule="exact" w:line="300"/>
+              <w:ind w:left="692" w:hanging="238"/>
+              <w:snapToGrid w:val="0"/>
+              <w:autoSpaceDE w:val="0"/>
+              <w:autoSpaceDN w:val="0"/>
             </w:pPr>
             <w:r>
               <w:rPr>
-                <w:rFonts w:ascii="Arial" w:hAnsi="Arial" w:cs="Arial"/>
+                <w:rFonts w:ascii="Calibri" w:hAnsi="Calibri" w:cs="Calibri"/>
+                <w:b w:val="0"/>
+                <w:i w:val="0"/>
+                <w:color w:val="14181C"/>
+                <w:sz w:val="24"/>
+              </w:rPr>
+              <w:t>•  калибр и сорт</w:t>
+            </w:r>
+          </w:p>
+          <w:p>
+            <w:pPr>
+              <w:widowControl w:val="0"/>
+              <w:spacing w:before="0" w:after="0" w:lineRule="exact" w:line="300"/>
+              <w:ind w:left="692" w:hanging="238"/>
+              <w:snapToGrid w:val="0"/>
+              <w:autoSpaceDE w:val="0"/>
+              <w:autoSpaceDN w:val="0"/>
+            </w:pPr>
+            <w:r>
+              <w:rPr>
+                <w:rFonts w:ascii="Calibri" w:hAnsi="Calibri" w:cs="Calibri"/>
+                <w:b w:val="0"/>
+                <w:i w:val="0"/>
+                <w:color w:val="14181C"/>
+                <w:sz w:val="24"/>
+              </w:rPr>
+              <w:t>•  упаковка и поддон</w:t>
+            </w:r>
+          </w:p>
+          <w:p>
+            <w:pPr>
+              <w:widowControl w:val="0"/>
+              <w:spacing w:before="0" w:after="0" w:lineRule="exact" w:line="300"/>
+              <w:ind w:left="692" w:hanging="238"/>
+              <w:snapToGrid w:val="0"/>
+              <w:autoSpaceDE w:val="0"/>
+              <w:autoSpaceDN w:val="0"/>
+            </w:pPr>
+            <w:r>
+              <w:rPr>
+                <w:rFonts w:ascii="Calibri" w:hAnsi="Calibri" w:cs="Calibri"/>
+                <w:b w:val="0"/>
+                <w:i w:val="0"/>
+                <w:color w:val="14181C"/>
+                <w:sz w:val="24"/>
+              </w:rPr>
+              <w:t>•  что снять на фото или видео</w:t>
+            </w:r>
+          </w:p>
+          <w:p>
+            <w:pPr>
+              <w:widowControl w:val="0"/>
+              <w:spacing w:before="0" w:after="0" w:lineRule="exact" w:line="300"/>
+              <w:ind w:left="692" w:hanging="238"/>
+              <w:snapToGrid w:val="0"/>
+              <w:autoSpaceDE w:val="0"/>
+              <w:autoSpaceDN w:val="0"/>
+            </w:pPr>
+            <w:r>
+              <w:rPr>
+                <w:rFonts w:ascii="Calibri" w:hAnsi="Calibri" w:cs="Calibri"/>
+                <w:b w:val="0"/>
+                <w:i w:val="0"/>
+                <w:color w:val="14181C"/>
+                <w:sz w:val="24"/>
+              </w:rPr>
+              <w:t>•  нужен ли анализ или другой документ</w:t>
+            </w:r>
+          </w:p>
+          <w:p>
+            <w:pPr>
+              <w:widowControl w:val="0"/>
+              <w:spacing w:before="20" w:after="0" w:lineRule="exact" w:line="300"/>
+              <w:ind w:left="454"/>
+              <w:snapToGrid w:val="0"/>
+              <w:autoSpaceDE w:val="0"/>
+              <w:autoSpaceDN w:val="0"/>
+            </w:pPr>
+            <w:r>
+              <w:rPr>
+                <w:rFonts w:ascii="Calibri" w:hAnsi="Calibri" w:cs="Calibri"/>
                 <w:b/>
-                <w:color w:val="8C2D1E"/>
+                <w:i w:val="0"/>
+                <w:color w:val="99281C"/>
                 <w:sz w:val="24"/>
               </w:rPr>
               <w:t xml:space="preserve">Стоп. </w:t>
             </w:r>
             <w:r>
               <w:rPr>
-                <w:rFonts w:ascii="Arial" w:hAnsi="Arial" w:cs="Arial"/>
+                <w:rFonts w:ascii="Calibri" w:hAnsi="Calibri" w:cs="Calibri"/>
                 <w:b/>
+                <w:i w:val="0"/>
+                <w:color w:val="14181C"/>
                 <w:sz w:val="24"/>
               </w:rPr>
               <w:t>Комментарий не прочитан — к выгрузке не переходи.</w:t>
@@ -387,95 +559,134 @@
         </w:trPr>
         <w:tc>
           <w:tcPr>
-            <w:tcW w:type="dxa" w:w="907"/>
-            <w:shd w:val="clear" w:color="auto" w:fill="1B4F72"/>
+            <w:tcW w:type="dxa" w:w="10318"/>
+            <w:shd w:val="clear" w:color="auto" w:fill="FFFFFF"/>
             <w:tcMar>
-              <w:top w:w="79" w:type="dxa"/>
-              <w:left w:w="34" w:type="dxa"/>
-              <w:bottom w:w="79" w:type="dxa"/>
-              <w:right w:w="34" w:type="dxa"/>
+              <w:top w:w="65" w:type="dxa"/>
+              <w:left w:w="125" w:type="dxa"/>
+              <w:bottom w:w="60" w:type="dxa"/>
+              <w:right w:w="113" w:type="dxa"/>
             </w:tcMar>
-            <w:vAlign w:val="center"/>
           </w:tcPr>
           <w:p>
             <w:pPr>
-              <w:spacing w:before="0" w:after="0" w:line="240" w:lineRule="auto"/>
-              <w:jc w:val="center"/>
-              <w:keepLines/>
+              <w:widowControl w:val="0"/>
+              <w:spacing w:before="0" w:after="20" w:lineRule="exact" w:line="320"/>
+              <w:ind w:left="0"/>
+              <w:snapToGrid w:val="0"/>
+              <w:tabs>
+                <w:tab w:pos="454" w:val="left"/>
+              </w:tabs>
+              <w:autoSpaceDE w:val="0"/>
+              <w:autoSpaceDN w:val="0"/>
             </w:pPr>
             <w:r>
               <w:rPr>
-                <w:rFonts w:ascii="Arial" w:hAnsi="Arial" w:cs="Arial"/>
+                <w:rFonts w:ascii="Calibri" w:hAnsi="Calibri" w:cs="Calibri"/>
                 <w:b/>
-                <w:color w:val="FFFFFF"/>
-                <w:sz w:val="44"/>
+                <w:i w:val="0"/>
+                <w:color w:val="1B3650"/>
+                <w:sz w:val="28"/>
               </w:rPr>
               <w:t>4</w:t>
             </w:r>
-          </w:p>
-        </w:tc>
-        <w:tc>
-          <w:tcPr>
-            <w:tcW w:type="dxa" w:w="9638"/>
-            <w:shd w:val="clear" w:color="auto" w:fill="FFFFFF"/>
-            <w:tcMar>
-              <w:top w:w="74" w:type="dxa"/>
-              <w:left w:w="136" w:type="dxa"/>
-              <w:bottom w:w="79" w:type="dxa"/>
-              <w:right w:w="125" w:type="dxa"/>
-            </w:tcMar>
-            <w:vAlign w:val="center"/>
-          </w:tcPr>
-          <w:p>
-            <w:pPr>
-              <w:spacing w:before="0" w:after="20" w:line="230" w:lineRule="auto"/>
-              <w:jc w:val="left"/>
-              <w:keepLines/>
-            </w:pPr>
             <w:r>
               <w:rPr>
-                <w:rFonts w:ascii="Arial" w:hAnsi="Arial" w:cs="Arial"/>
+                <w:rFonts w:ascii="Calibri" w:hAnsi="Calibri" w:cs="Calibri"/>
                 <w:b/>
-                <w:color w:val="143048"/>
-                <w:sz w:val="28"/>
+                <w:i w:val="0"/>
+                <w:color w:val="1B3650"/>
+                <w:sz w:val="26"/>
               </w:rPr>
-              <w:t>Проверь качество</w:t>
+              <w:tab/>
+              <w:t>Проверь качество на образце</w:t>
             </w:r>
           </w:p>
           <w:p>
             <w:pPr>
-              <w:spacing w:before="0" w:after="20" w:line="230" w:lineRule="auto"/>
-              <w:jc w:val="left"/>
-              <w:keepLines/>
+              <w:widowControl w:val="0"/>
+              <w:spacing w:before="0" w:after="0" w:lineRule="exact" w:line="300"/>
+              <w:ind w:left="692" w:hanging="238"/>
+              <w:snapToGrid w:val="0"/>
+              <w:autoSpaceDE w:val="0"/>
+              <w:autoSpaceDN w:val="0"/>
             </w:pPr>
             <w:r>
               <w:rPr>
-                <w:rFonts w:ascii="Arial" w:hAnsi="Arial" w:cs="Arial"/>
+                <w:rFonts w:ascii="Calibri" w:hAnsi="Calibri" w:cs="Calibri"/>
                 <w:b w:val="0"/>
+                <w:i w:val="0"/>
+                <w:color w:val="14181C"/>
                 <w:sz w:val="24"/>
               </w:rPr>
-              <w:t>Сначала один образец, не всю машину. Сними фото и видео, как написано в комментарии. Сверь сорт и калибр с заказом. Анализ посмотри, если он нужен.</w:t>
+              <w:t>•  сними фото и видео так, как написано в комментарии</w:t>
             </w:r>
           </w:p>
           <w:p>
             <w:pPr>
-              <w:spacing w:before="20" w:after="0" w:line="230" w:lineRule="auto"/>
-              <w:jc w:val="left"/>
-              <w:keepLines/>
+              <w:widowControl w:val="0"/>
+              <w:spacing w:before="0" w:after="0" w:lineRule="exact" w:line="300"/>
+              <w:ind w:left="692" w:hanging="238"/>
+              <w:snapToGrid w:val="0"/>
+              <w:autoSpaceDE w:val="0"/>
+              <w:autoSpaceDN w:val="0"/>
             </w:pPr>
             <w:r>
               <w:rPr>
-                <w:rFonts w:ascii="Arial" w:hAnsi="Arial" w:cs="Arial"/>
+                <w:rFonts w:ascii="Calibri" w:hAnsi="Calibri" w:cs="Calibri"/>
+                <w:b w:val="0"/>
+                <w:i w:val="0"/>
+                <w:color w:val="14181C"/>
+                <w:sz w:val="24"/>
+              </w:rPr>
+              <w:t>•  сверь сорт и калибр с заказом</w:t>
+            </w:r>
+          </w:p>
+          <w:p>
+            <w:pPr>
+              <w:widowControl w:val="0"/>
+              <w:spacing w:before="0" w:after="0" w:lineRule="exact" w:line="300"/>
+              <w:ind w:left="692" w:hanging="238"/>
+              <w:snapToGrid w:val="0"/>
+              <w:autoSpaceDE w:val="0"/>
+              <w:autoSpaceDN w:val="0"/>
+            </w:pPr>
+            <w:r>
+              <w:rPr>
+                <w:rFonts w:ascii="Calibri" w:hAnsi="Calibri" w:cs="Calibri"/>
+                <w:b w:val="0"/>
+                <w:i w:val="0"/>
+                <w:color w:val="14181C"/>
+                <w:sz w:val="24"/>
+              </w:rPr>
+              <w:t>•  анализ посмотри, если он нужен</w:t>
+            </w:r>
+          </w:p>
+          <w:p>
+            <w:pPr>
+              <w:widowControl w:val="0"/>
+              <w:spacing w:before="20" w:after="0" w:lineRule="exact" w:line="300"/>
+              <w:ind w:left="454"/>
+              <w:snapToGrid w:val="0"/>
+              <w:autoSpaceDE w:val="0"/>
+              <w:autoSpaceDN w:val="0"/>
+            </w:pPr>
+            <w:r>
+              <w:rPr>
+                <w:rFonts w:ascii="Calibri" w:hAnsi="Calibri" w:cs="Calibri"/>
                 <w:b/>
-                <w:color w:val="8C2D1E"/>
+                <w:i w:val="0"/>
+                <w:color w:val="99281C"/>
                 <w:sz w:val="24"/>
               </w:rPr>
               <w:t xml:space="preserve">Стоп. </w:t>
             </w:r>
             <w:r>
               <w:rPr>
-                <w:rFonts w:ascii="Arial" w:hAnsi="Arial" w:cs="Arial"/>
+                <w:rFonts w:ascii="Calibri" w:hAnsi="Calibri" w:cs="Calibri"/>
                 <w:b/>
+                <w:i w:val="0"/>
+                <w:color w:val="14181C"/>
                 <w:sz w:val="24"/>
               </w:rPr>
               <w:t>Товар не тот, порченый или анализа нет — остановись и позови офис.</w:t>
@@ -489,98 +700,157 @@
         </w:trPr>
         <w:tc>
           <w:tcPr>
-            <w:tcW w:type="dxa" w:w="907"/>
-            <w:shd w:val="clear" w:color="auto" w:fill="1B4F72"/>
+            <w:tcW w:type="dxa" w:w="10318"/>
+            <w:shd w:val="clear" w:color="auto" w:fill="FFFFFF"/>
             <w:tcMar>
-              <w:top w:w="79" w:type="dxa"/>
-              <w:left w:w="34" w:type="dxa"/>
-              <w:bottom w:w="79" w:type="dxa"/>
-              <w:right w:w="34" w:type="dxa"/>
+              <w:top w:w="65" w:type="dxa"/>
+              <w:left w:w="125" w:type="dxa"/>
+              <w:bottom w:w="60" w:type="dxa"/>
+              <w:right w:w="113" w:type="dxa"/>
             </w:tcMar>
-            <w:vAlign w:val="center"/>
           </w:tcPr>
           <w:p>
             <w:pPr>
-              <w:spacing w:before="0" w:after="0" w:line="240" w:lineRule="auto"/>
-              <w:jc w:val="center"/>
-              <w:keepLines/>
+              <w:widowControl w:val="0"/>
+              <w:spacing w:before="0" w:after="20" w:lineRule="exact" w:line="320"/>
+              <w:ind w:left="0"/>
+              <w:snapToGrid w:val="0"/>
+              <w:tabs>
+                <w:tab w:pos="454" w:val="left"/>
+              </w:tabs>
+              <w:autoSpaceDE w:val="0"/>
+              <w:autoSpaceDN w:val="0"/>
             </w:pPr>
             <w:r>
               <w:rPr>
-                <w:rFonts w:ascii="Arial" w:hAnsi="Arial" w:cs="Arial"/>
+                <w:rFonts w:ascii="Calibri" w:hAnsi="Calibri" w:cs="Calibri"/>
                 <w:b/>
-                <w:color w:val="FFFFFF"/>
-                <w:sz w:val="44"/>
+                <w:i w:val="0"/>
+                <w:color w:val="1B3650"/>
+                <w:sz w:val="28"/>
               </w:rPr>
               <w:t>5</w:t>
             </w:r>
-          </w:p>
-        </w:tc>
-        <w:tc>
-          <w:tcPr>
-            <w:tcW w:type="dxa" w:w="9638"/>
-            <w:shd w:val="clear" w:color="auto" w:fill="FFFFFF"/>
-            <w:tcMar>
-              <w:top w:w="74" w:type="dxa"/>
-              <w:left w:w="136" w:type="dxa"/>
-              <w:bottom w:w="79" w:type="dxa"/>
-              <w:right w:w="125" w:type="dxa"/>
-            </w:tcMar>
-            <w:vAlign w:val="center"/>
-          </w:tcPr>
-          <w:p>
-            <w:pPr>
-              <w:spacing w:before="0" w:after="20" w:line="230" w:lineRule="auto"/>
-              <w:jc w:val="left"/>
-              <w:keepLines/>
-            </w:pPr>
             <w:r>
               <w:rPr>
-                <w:rFonts w:ascii="Arial" w:hAnsi="Arial" w:cs="Arial"/>
+                <w:rFonts w:ascii="Calibri" w:hAnsi="Calibri" w:cs="Calibri"/>
                 <w:b/>
-                <w:color w:val="143048"/>
-                <w:sz w:val="28"/>
+                <w:i w:val="0"/>
+                <w:color w:val="1B3650"/>
+                <w:sz w:val="26"/>
               </w:rPr>
-              <w:t>Выгрузи и наклей паспорт</w:t>
+              <w:tab/>
+              <w:t>Выгрузи паллету и наклей паспорт</w:t>
             </w:r>
           </w:p>
           <w:p>
             <w:pPr>
-              <w:spacing w:before="0" w:after="20" w:line="230" w:lineRule="auto"/>
-              <w:jc w:val="left"/>
-              <w:keepLines/>
+              <w:widowControl w:val="0"/>
+              <w:spacing w:before="0" w:after="0" w:lineRule="exact" w:line="300"/>
+              <w:ind w:left="692" w:hanging="238"/>
+              <w:snapToGrid w:val="0"/>
+              <w:autoSpaceDE w:val="0"/>
+              <w:autoSpaceDN w:val="0"/>
             </w:pPr>
             <w:r>
               <w:rPr>
-                <w:rFonts w:ascii="Arial" w:hAnsi="Arial" w:cs="Arial"/>
+                <w:rFonts w:ascii="Calibri" w:hAnsi="Calibri" w:cs="Calibri"/>
                 <w:b w:val="0"/>
+                <w:i w:val="0"/>
+                <w:color w:val="14181C"/>
                 <w:sz w:val="24"/>
               </w:rPr>
-              <w:t>Каждую паллету заведи отдельно: товар из заказа, калибр, сорт, поддон, упаковка, сколько мест и вес с весов. Чистый вес программа посчитает — проверь его. Если товар для клиента, укажи клиента. Паспорт — листок с номером паллеты: напечатай и сразу наклей на эту паллету.</w:t>
+              <w:t>•  товар из заказа, калибр и сорт</w:t>
             </w:r>
           </w:p>
           <w:p>
             <w:pPr>
-              <w:spacing w:before="20" w:after="0" w:line="230" w:lineRule="auto"/>
-              <w:jc w:val="left"/>
-              <w:keepLines/>
+              <w:widowControl w:val="0"/>
+              <w:spacing w:before="0" w:after="0" w:lineRule="exact" w:line="300"/>
+              <w:ind w:left="692" w:hanging="238"/>
+              <w:snapToGrid w:val="0"/>
+              <w:autoSpaceDE w:val="0"/>
+              <w:autoSpaceDN w:val="0"/>
             </w:pPr>
             <w:r>
               <w:rPr>
-                <w:rFonts w:ascii="Arial" w:hAnsi="Arial" w:cs="Arial"/>
+                <w:rFonts w:ascii="Calibri" w:hAnsi="Calibri" w:cs="Calibri"/>
+                <w:b w:val="0"/>
+                <w:i w:val="0"/>
+                <w:color w:val="14181C"/>
+                <w:sz w:val="24"/>
+              </w:rPr>
+              <w:t>•  поддон, упаковка и число мест</w:t>
+            </w:r>
+          </w:p>
+          <w:p>
+            <w:pPr>
+              <w:widowControl w:val="0"/>
+              <w:spacing w:before="0" w:after="0" w:lineRule="exact" w:line="300"/>
+              <w:ind w:left="692" w:hanging="238"/>
+              <w:snapToGrid w:val="0"/>
+              <w:autoSpaceDE w:val="0"/>
+              <w:autoSpaceDN w:val="0"/>
+            </w:pPr>
+            <w:r>
+              <w:rPr>
+                <w:rFonts w:ascii="Calibri" w:hAnsi="Calibri" w:cs="Calibri"/>
+                <w:b w:val="0"/>
+                <w:i w:val="0"/>
+                <w:color w:val="14181C"/>
+                <w:sz w:val="24"/>
+              </w:rPr>
+              <w:t>•  вес с весов и чистый вес — программа посчитает, проверь</w:t>
+            </w:r>
+          </w:p>
+          <w:p>
+            <w:pPr>
+              <w:widowControl w:val="0"/>
+              <w:spacing w:before="0" w:after="0" w:lineRule="exact" w:line="300"/>
+              <w:ind w:left="692" w:hanging="238"/>
+              <w:snapToGrid w:val="0"/>
+              <w:autoSpaceDE w:val="0"/>
+              <w:autoSpaceDN w:val="0"/>
+            </w:pPr>
+            <w:r>
+              <w:rPr>
+                <w:rFonts w:ascii="Calibri" w:hAnsi="Calibri" w:cs="Calibri"/>
+                <w:b w:val="0"/>
+                <w:i w:val="0"/>
+                <w:color w:val="14181C"/>
+                <w:sz w:val="24"/>
+              </w:rPr>
+              <w:t>•  клиент, если товар ждёт именно его</w:t>
+            </w:r>
+          </w:p>
+          <w:p>
+            <w:pPr>
+              <w:widowControl w:val="0"/>
+              <w:spacing w:before="20" w:after="0" w:lineRule="exact" w:line="300"/>
+              <w:ind w:left="454"/>
+              <w:snapToGrid w:val="0"/>
+              <w:autoSpaceDE w:val="0"/>
+              <w:autoSpaceDN w:val="0"/>
+            </w:pPr>
+            <w:r>
+              <w:rPr>
+                <w:rFonts w:ascii="Calibri" w:hAnsi="Calibri" w:cs="Calibri"/>
                 <w:b/>
-                <w:color w:val="8C2D1E"/>
+                <w:i w:val="0"/>
+                <w:color w:val="99281C"/>
                 <w:sz w:val="24"/>
               </w:rPr>
               <w:t xml:space="preserve">Стоп. </w:t>
             </w:r>
             <w:r>
               <w:rPr>
-                <w:rFonts w:ascii="Arial" w:hAnsi="Arial" w:cs="Arial"/>
+                <w:rFonts w:ascii="Calibri" w:hAnsi="Calibri" w:cs="Calibri"/>
                 <w:b/>
+                <w:i w:val="0"/>
+                <w:color w:val="14181C"/>
                 <w:sz w:val="24"/>
               </w:rPr>
-              <w:t>Без паспорта паллету на место не ставь.</w:t>
+              <w:t>Паспорт — листок с номером. Наклей сразу. Без паспорта паллету не ставь.</w:t>
             </w:r>
           </w:p>
         </w:tc>
@@ -591,95 +861,114 @@
         </w:trPr>
         <w:tc>
           <w:tcPr>
-            <w:tcW w:type="dxa" w:w="907"/>
-            <w:shd w:val="clear" w:color="auto" w:fill="1B4F72"/>
+            <w:tcW w:type="dxa" w:w="10318"/>
+            <w:shd w:val="clear" w:color="auto" w:fill="FFFFFF"/>
             <w:tcMar>
-              <w:top w:w="79" w:type="dxa"/>
-              <w:left w:w="34" w:type="dxa"/>
-              <w:bottom w:w="79" w:type="dxa"/>
-              <w:right w:w="34" w:type="dxa"/>
+              <w:top w:w="65" w:type="dxa"/>
+              <w:left w:w="125" w:type="dxa"/>
+              <w:bottom w:w="60" w:type="dxa"/>
+              <w:right w:w="113" w:type="dxa"/>
             </w:tcMar>
-            <w:vAlign w:val="center"/>
           </w:tcPr>
           <w:p>
             <w:pPr>
-              <w:spacing w:before="0" w:after="0" w:line="240" w:lineRule="auto"/>
-              <w:jc w:val="center"/>
-              <w:keepLines/>
+              <w:widowControl w:val="0"/>
+              <w:spacing w:before="0" w:after="20" w:lineRule="exact" w:line="320"/>
+              <w:ind w:left="0"/>
+              <w:snapToGrid w:val="0"/>
+              <w:tabs>
+                <w:tab w:pos="454" w:val="left"/>
+              </w:tabs>
+              <w:autoSpaceDE w:val="0"/>
+              <w:autoSpaceDN w:val="0"/>
             </w:pPr>
             <w:r>
               <w:rPr>
-                <w:rFonts w:ascii="Arial" w:hAnsi="Arial" w:cs="Arial"/>
+                <w:rFonts w:ascii="Calibri" w:hAnsi="Calibri" w:cs="Calibri"/>
                 <w:b/>
-                <w:color w:val="FFFFFF"/>
-                <w:sz w:val="44"/>
+                <w:i w:val="0"/>
+                <w:color w:val="1B3650"/>
+                <w:sz w:val="28"/>
               </w:rPr>
               <w:t>6</w:t>
             </w:r>
-          </w:p>
-        </w:tc>
-        <w:tc>
-          <w:tcPr>
-            <w:tcW w:type="dxa" w:w="9638"/>
-            <w:shd w:val="clear" w:color="auto" w:fill="FFFFFF"/>
-            <w:tcMar>
-              <w:top w:w="74" w:type="dxa"/>
-              <w:left w:w="136" w:type="dxa"/>
-              <w:bottom w:w="79" w:type="dxa"/>
-              <w:right w:w="125" w:type="dxa"/>
-            </w:tcMar>
-            <w:vAlign w:val="center"/>
-          </w:tcPr>
-          <w:p>
-            <w:pPr>
-              <w:spacing w:before="0" w:after="20" w:line="230" w:lineRule="auto"/>
-              <w:jc w:val="left"/>
-              <w:keepLines/>
-            </w:pPr>
             <w:r>
               <w:rPr>
-                <w:rFonts w:ascii="Arial" w:hAnsi="Arial" w:cs="Arial"/>
+                <w:rFonts w:ascii="Calibri" w:hAnsi="Calibri" w:cs="Calibri"/>
                 <w:b/>
-                <w:color w:val="143048"/>
-                <w:sz w:val="28"/>
+                <w:i w:val="0"/>
+                <w:color w:val="1B3650"/>
+                <w:sz w:val="26"/>
               </w:rPr>
-              <w:t>Сверь вес и закрой</w:t>
+              <w:tab/>
+              <w:t>Сверь вес и закрой приёмку</w:t>
             </w:r>
           </w:p>
           <w:p>
             <w:pPr>
-              <w:spacing w:before="0" w:after="20" w:line="230" w:lineRule="auto"/>
-              <w:jc w:val="left"/>
-              <w:keepLines/>
+              <w:widowControl w:val="0"/>
+              <w:spacing w:before="0" w:after="0" w:lineRule="exact" w:line="300"/>
+              <w:ind w:left="692" w:hanging="238"/>
+              <w:snapToGrid w:val="0"/>
+              <w:autoSpaceDE w:val="0"/>
+              <w:autoSpaceDN w:val="0"/>
             </w:pPr>
             <w:r>
               <w:rPr>
-                <w:rFonts w:ascii="Arial" w:hAnsi="Arial" w:cs="Arial"/>
+                <w:rFonts w:ascii="Calibri" w:hAnsi="Calibri" w:cs="Calibri"/>
                 <w:b w:val="0"/>
+                <w:i w:val="0"/>
+                <w:color w:val="14181C"/>
                 <w:sz w:val="24"/>
               </w:rPr>
-              <w:t>Сложи чистый вес отдельно по товару, по калибру и по сорту. Сравни эту сумму с заказом и с накладной водителя.</w:t>
+              <w:t>•  сложи чистый вес отдельно по товару, калибру и сорту</w:t>
             </w:r>
           </w:p>
           <w:p>
             <w:pPr>
-              <w:spacing w:before="20" w:after="0" w:line="230" w:lineRule="auto"/>
-              <w:jc w:val="left"/>
-              <w:keepLines/>
+              <w:widowControl w:val="0"/>
+              <w:spacing w:before="0" w:after="0" w:lineRule="exact" w:line="300"/>
+              <w:ind w:left="692" w:hanging="238"/>
+              <w:snapToGrid w:val="0"/>
+              <w:autoSpaceDE w:val="0"/>
+              <w:autoSpaceDN w:val="0"/>
             </w:pPr>
             <w:r>
               <w:rPr>
-                <w:rFonts w:ascii="Arial" w:hAnsi="Arial" w:cs="Arial"/>
+                <w:rFonts w:ascii="Calibri" w:hAnsi="Calibri" w:cs="Calibri"/>
+                <w:b w:val="0"/>
+                <w:i w:val="0"/>
+                <w:color w:val="14181C"/>
+                <w:sz w:val="24"/>
+              </w:rPr>
+              <w:t>•  сравни сумму с заказом и с накладной водителя</w:t>
+            </w:r>
+          </w:p>
+          <w:p>
+            <w:pPr>
+              <w:widowControl w:val="0"/>
+              <w:spacing w:before="20" w:after="0" w:lineRule="exact" w:line="300"/>
+              <w:ind w:left="454"/>
+              <w:snapToGrid w:val="0"/>
+              <w:autoSpaceDE w:val="0"/>
+              <w:autoSpaceDN w:val="0"/>
+            </w:pPr>
+            <w:r>
+              <w:rPr>
+                <w:rFonts w:ascii="Calibri" w:hAnsi="Calibri" w:cs="Calibri"/>
                 <w:b/>
-                <w:color w:val="8C2D1E"/>
+                <w:i w:val="0"/>
+                <w:color w:val="99281C"/>
                 <w:sz w:val="24"/>
               </w:rPr>
               <w:t xml:space="preserve">Стоп. </w:t>
             </w:r>
             <w:r>
               <w:rPr>
-                <w:rFonts w:ascii="Arial" w:hAnsi="Arial" w:cs="Arial"/>
+                <w:rFonts w:ascii="Calibri" w:hAnsi="Calibri" w:cs="Calibri"/>
                 <w:b/>
+                <w:i w:val="0"/>
+                <w:color w:val="14181C"/>
                 <w:sz w:val="24"/>
               </w:rPr>
               <w:t>Цифры не сошлись — сначала звонок в офис, потом закрытие.</w:t>
@@ -690,35 +979,40 @@
     </w:tbl>
     <w:p>
       <w:pPr>
-        <w:spacing w:before="0" w:after="0" w:line="120" w:lineRule="auto"/>
-        <w:jc w:val="left"/>
-        <w:keepLines/>
+        <w:widowControl w:val="0"/>
+        <w:spacing w:before="0" w:after="0" w:lineRule="exact" w:line="160"/>
+        <w:ind w:left="0"/>
+        <w:snapToGrid w:val="0"/>
+        <w:autoSpaceDE w:val="0"/>
+        <w:autoSpaceDN w:val="0"/>
       </w:pPr>
       <w:r>
         <w:rPr>
-          <w:rFonts w:ascii="Arial" w:hAnsi="Arial" w:cs="Arial"/>
+          <w:rFonts w:ascii="Calibri" w:hAnsi="Calibri" w:cs="Calibri"/>
           <w:b w:val="0"/>
-          <w:sz w:val="12"/>
+          <w:i w:val="0"/>
+          <w:color w:val="14181C"/>
+          <w:sz w:val="8"/>
         </w:rPr>
       </w:r>
     </w:p>
     <w:tbl>
       <w:tblPr>
-        <w:tblW w:type="dxa" w:w="10545"/>
+        <w:tblW w:type="dxa" w:w="10318"/>
         <w:jc w:val="center"/>
         <w:tblLayout w:type="fixed"/>
         <w:tblLook w:firstColumn="1" w:firstRow="1" w:lastColumn="0" w:lastRow="0" w:noHBand="0" w:noVBand="1" w:val="04A0"/>
         <w:tblBorders>
-          <w:top w:val="single" w:sz="8" w:space="0" w:color="1B4F72"/>
-          <w:left w:val="single" w:sz="8" w:space="0" w:color="1B4F72"/>
-          <w:bottom w:val="single" w:sz="8" w:space="0" w:color="1B4F72"/>
-          <w:right w:val="single" w:sz="8" w:space="0" w:color="1B4F72"/>
-          <w:insideH w:val="single" w:sz="8" w:space="0" w:color="1B4F72"/>
-          <w:insideV w:val="single" w:sz="8" w:space="0" w:color="1B4F72"/>
+          <w:top w:val="single" w:sz="8" w:space="0" w:color="1B3650"/>
+          <w:left w:val="single" w:sz="8" w:space="0" w:color="1B3650"/>
+          <w:bottom w:val="single" w:sz="8" w:space="0" w:color="1B3650"/>
+          <w:right w:val="single" w:sz="8" w:space="0" w:color="1B3650"/>
+          <w:insideH w:val="single" w:sz="8" w:space="0" w:color="1B3650"/>
+          <w:insideV w:val="single" w:sz="8" w:space="0" w:color="1B3650"/>
         </w:tblBorders>
       </w:tblPr>
       <w:tblGrid>
-        <w:gridCol w:w="10545"/>
+        <w:gridCol w:w="10318"/>
       </w:tblGrid>
       <w:tr>
         <w:trPr>
@@ -726,44 +1020,53 @@
         </w:trPr>
         <w:tc>
           <w:tcPr>
-            <w:tcW w:type="dxa" w:w="10545"/>
+            <w:tcW w:type="dxa" w:w="10318"/>
             <w:shd w:val="clear" w:color="auto" w:fill="F4F7FA"/>
             <w:tcMar>
-              <w:top w:w="79" w:type="dxa"/>
+              <w:top w:w="85" w:type="dxa"/>
               <w:left w:w="136" w:type="dxa"/>
-              <w:bottom w:w="79" w:type="dxa"/>
-              <w:right w:w="136" w:type="dxa"/>
+              <w:bottom w:w="85" w:type="dxa"/>
+              <w:right w:w="125" w:type="dxa"/>
             </w:tcMar>
           </w:tcPr>
           <w:p>
             <w:pPr>
-              <w:spacing w:before="0" w:after="20" w:line="216" w:lineRule="auto"/>
-              <w:jc w:val="left"/>
-              <w:keepLines/>
+              <w:widowControl w:val="0"/>
+              <w:spacing w:before="0" w:after="20" w:lineRule="exact" w:line="320"/>
+              <w:ind w:left="0"/>
+              <w:snapToGrid w:val="0"/>
+              <w:autoSpaceDE w:val="0"/>
+              <w:autoSpaceDN w:val="0"/>
             </w:pPr>
             <w:r>
               <w:rPr>
-                <w:rFonts w:ascii="Arial" w:hAnsi="Arial" w:cs="Arial"/>
+                <w:rFonts w:ascii="Calibri" w:hAnsi="Calibri" w:cs="Calibri"/>
                 <w:b/>
-                <w:color w:val="143048"/>
-                <w:sz w:val="26"/>
+                <w:i w:val="0"/>
+                <w:color w:val="1B3650"/>
+                <w:sz w:val="24"/>
               </w:rPr>
               <w:t>Чистый вес — это вес самого товара.</w:t>
             </w:r>
           </w:p>
           <w:p>
             <w:pPr>
-              <w:spacing w:before="0" w:after="0" w:line="230" w:lineRule="auto"/>
-              <w:jc w:val="left"/>
-              <w:keepLines/>
+              <w:widowControl w:val="0"/>
+              <w:spacing w:before="0" w:after="0" w:lineRule="exact" w:line="300"/>
+              <w:ind w:left="0"/>
+              <w:snapToGrid w:val="0"/>
+              <w:autoSpaceDE w:val="0"/>
+              <w:autoSpaceDN w:val="0"/>
             </w:pPr>
             <w:r>
               <w:rPr>
-                <w:rFonts w:ascii="Arial" w:hAnsi="Arial" w:cs="Arial"/>
+                <w:rFonts w:ascii="Calibri" w:hAnsi="Calibri" w:cs="Calibri"/>
                 <w:b w:val="0"/>
+                <w:i w:val="0"/>
+                <w:color w:val="14181C"/>
                 <w:sz w:val="24"/>
               </w:rPr>
-              <w:t>С весов берут грязный вес. Из него вычитают поддон и упаковку. Европоддон 25 кг, американец 30 кг. Упаковку вычитай за каждое место.</w:t>
+              <w:t>Из веса на весах вычти поддон и упаковку. Европоддон 25 кг, американец 30 кг. Упаковку вычитай за каждое место.</w:t>
             </w:r>
           </w:p>
         </w:tc>
@@ -771,7 +1074,7 @@
     </w:tbl>
     <w:sectPr>
       <w:pgSz w:w="11906" w:h="16838"/>
-      <w:pgMar w:top="567" w:right="680" w:bottom="567" w:left="680" w:header="340" w:footer="340" w:gutter="0"/>
+      <w:pgMar w:top="680" w:right="794" w:bottom="680" w:left="794" w:header="283" w:footer="283" w:gutter="0"/>
       <w:cols w:space="720"/>
       <w:docGrid w:linePitch="360"/>
     </w:sectPr>
@@ -1143,10 +1446,11 @@
     <w:qFormat/>
     <w:rsid w:val="00FC693F"/>
     <w:pPr>
-      <w:spacing w:before="0" w:after="0"/>
+      <w:spacing w:before="0" w:after="0" w:lineRule="exact" w:line="300"/>
     </w:pPr>
     <w:rPr>
-      <w:rFonts w:ascii="Arial" w:hAnsi="Arial" w:cs="Arial"/>
+      <w:rFonts w:ascii="Calibri" w:hAnsi="Calibri" w:cs="Calibri"/>
+      <w:color w:val="14181C"/>
       <w:sz w:val="24"/>
     </w:rPr>
   </w:style>

</xml_diff>